<commit_message>
Modifications to feedback form.
</commit_message>
<xml_diff>
--- a/feedback_form.docx
+++ b/feedback_form.docx
@@ -66,7 +66,19 @@
         <w:rPr>
           <w:b/>
         </w:rPr>
-        <w:t>Tick one box:</w:t>
+        <w:t xml:space="preserve">Tick </w:t>
+      </w:r>
+      <w:r>
+        <w:rPr>
+          <w:b/>
+        </w:rPr>
+        <w:t>as appropriate</w:t>
+      </w:r>
+      <w:r>
+        <w:rPr>
+          <w:b/>
+        </w:rPr>
+        <w:t>:</w:t>
       </w:r>
     </w:p>
     <w:tbl>
@@ -191,10 +203,31 @@
           </w:tcPr>
           <w:p>
             <w:r>
-              <w:t xml:space="preserve">Other (please </w:t>
-            </w:r>
-            <w:r>
-              <w:t>give more details below</w:t>
+              <w:t>I’d rather learn this material some other way</w:t>
+            </w:r>
+            <w:r>
+              <w:br/>
+            </w:r>
+          </w:p>
+        </w:tc>
+        <w:tc>
+          <w:tcPr>
+            <w:tcW w:w="1560" w:type="dxa"/>
+          </w:tcPr>
+          <w:p/>
+        </w:tc>
+      </w:tr>
+      <w:tr>
+        <w:tc>
+          <w:tcPr>
+            <w:tcW w:w="6232" w:type="dxa"/>
+          </w:tcPr>
+          <w:p>
+            <w:r>
+              <w:t>Other (</w:t>
+            </w:r>
+            <w:r>
+              <w:t>use the space below if you want to give details</w:t>
             </w:r>
             <w:r>
               <w:t>)</w:t>

</xml_diff>